<commit_message>
docs: embed client-side view screenshots directly inside final Word report
</commit_message>
<xml_diff>
--- a/reports/TaskFlow_Final_Project_Report.docx
+++ b/reports/TaskFlow_Final_Project_Report.docx
@@ -556,6 +556,123 @@
           <w:szCs w:val="24"/>
         </w:rPr>
         <w:t xml:space="preserve">The project successfully achieved 100% of its initial objectives and compliance targets. Performance profiling confirmed sub-100ms API response times. The automated test suite completed with 19 passed assertions and 0 failures. Live production testing verified seamless user registration, persistent login sessions, real-time workload metrics, and mobile responsiveness across multiple screen widths.</w:t>
+      </w:r>
+    </w:p>
+    <w:p>
+      <w:pPr>
+        <w:pStyle w:val="Heading1"/>
+        <w:spacing w:after="120" w:before="300"/>
+      </w:pPr>
+      <w:r>
+        <w:t xml:space="preserve">SCREENSHOTS OF MAJOR CLIENT-SIDE VIEWS</w:t>
+      </w:r>
+    </w:p>
+    <w:p>
+      <w:pPr>
+        <w:pStyle w:val="Heading2"/>
+        <w:spacing w:after="100" w:before="200"/>
+      </w:pPr>
+      <w:r>
+        <w:t xml:space="preserve">Figure 1: Live TaskFlow Dashboard (Production Vercel &amp; Render)</w:t>
+      </w:r>
+    </w:p>
+    <w:p>
+      <w:pPr>
+        <w:spacing w:after="200"/>
+      </w:pPr>
+      <w:r>
+        <w:drawing>
+          <wp:inline distT="0" distB="0" distL="0" distR="0">
+            <wp:extent cx="5524500" cy="2762250"/>
+            <wp:effectExtent t="0" r="0" b="0" l="0"/>
+            <wp:docPr id="1" name=""/>
+            <wp:cNvGraphicFramePr>
+              <a:graphicFrameLocks xmlns:a="http://schemas.openxmlformats.org/drawingml/2006/main" noChangeAspect="1"/>
+            </wp:cNvGraphicFramePr>
+            <a:graphic xmlns:a="http://schemas.openxmlformats.org/drawingml/2006/main">
+              <a:graphicData uri="http://schemas.openxmlformats.org/drawingml/2006/picture">
+                <pic:pic xmlns:pic="http://schemas.openxmlformats.org/drawingml/2006/picture">
+                  <pic:nvPicPr>
+                    <pic:cNvPr id="0" name="" descr=""/>
+                    <pic:cNvPicPr>
+                      <a:picLocks noChangeAspect="1" noChangeArrowheads="1"/>
+                    </pic:cNvPicPr>
+                  </pic:nvPicPr>
+                  <pic:blipFill>
+                    <a:blip r:embed="rId7" cstate="none"/>
+                    <a:srcRect/>
+                    <a:stretch>
+                      <a:fillRect/>
+                    </a:stretch>
+                  </pic:blipFill>
+                  <pic:spPr bwMode="auto">
+                    <a:xfrm>
+                      <a:off x="0" y="0"/>
+                      <a:ext cx="5524500" cy="2762250"/>
+                    </a:xfrm>
+                    <a:prstGeom prst="rect">
+                      <a:avLst/>
+                    </a:prstGeom>
+                  </pic:spPr>
+                </pic:pic>
+              </a:graphicData>
+            </a:graphic>
+          </wp:inline>
+        </w:drawing>
+      </w:r>
+    </w:p>
+    <w:p>
+      <w:pPr>
+        <w:pStyle w:val="Heading2"/>
+        <w:spacing w:after="100" w:before="200"/>
+      </w:pPr>
+      <w:r>
+        <w:t xml:space="preserve">Figure 2: Production Deployment Status &amp; Login Interface (Vercel)</w:t>
+      </w:r>
+    </w:p>
+    <w:p>
+      <w:pPr>
+        <w:spacing w:after="200"/>
+      </w:pPr>
+      <w:r>
+        <w:drawing>
+          <wp:inline distT="0" distB="0" distL="0" distR="0">
+            <wp:extent cx="5524500" cy="2762250"/>
+            <wp:effectExtent t="0" r="0" b="0" l="0"/>
+            <wp:docPr id="2" name=""/>
+            <wp:cNvGraphicFramePr>
+              <a:graphicFrameLocks xmlns:a="http://schemas.openxmlformats.org/drawingml/2006/main" noChangeAspect="1"/>
+            </wp:cNvGraphicFramePr>
+            <a:graphic xmlns:a="http://schemas.openxmlformats.org/drawingml/2006/main">
+              <a:graphicData uri="http://schemas.openxmlformats.org/drawingml/2006/picture">
+                <pic:pic xmlns:pic="http://schemas.openxmlformats.org/drawingml/2006/picture">
+                  <pic:nvPicPr>
+                    <pic:cNvPr id="0" name="" descr=""/>
+                    <pic:cNvPicPr>
+                      <a:picLocks noChangeAspect="1" noChangeArrowheads="1"/>
+                    </pic:cNvPicPr>
+                  </pic:nvPicPr>
+                  <pic:blipFill>
+                    <a:blip r:embed="rId8" cstate="none"/>
+                    <a:srcRect/>
+                    <a:stretch>
+                      <a:fillRect/>
+                    </a:stretch>
+                  </pic:blipFill>
+                  <pic:spPr bwMode="auto">
+                    <a:xfrm>
+                      <a:off x="0" y="0"/>
+                      <a:ext cx="5524500" cy="2762250"/>
+                    </a:xfrm>
+                    <a:prstGeom prst="rect">
+                      <a:avLst/>
+                    </a:prstGeom>
+                  </pic:spPr>
+                </pic:pic>
+              </a:graphicData>
+            </a:graphic>
+          </wp:inline>
+        </w:drawing>
       </w:r>
     </w:p>
     <w:p>

</xml_diff>